<commit_message>
docs(resume): synchronize resume.pdf and resume_single_column.pdf with vantage.kishor.tech
</commit_message>
<xml_diff>
--- a/resume.docx
+++ b/resume.docx
@@ -162,7 +162,7 @@
                 <w:color w:val="464646"/>
                 <w:sz w:val="15"/>
               </w:rPr>
-              <w:t>1703053@student.ruet.ac.bd   |   kishor.ruet.cse@gmail.com   |   +880 1724-714156 (WhatsApp)   |   macos-portfolio   |   linkedin.com/in/kishor-kumar-paroi-b06344166   |   github.com/KishorKumarParoi   |   x.com/Mr_paroi</w:t>
+              <w:t>1703053@student.ruet.ac.bd   |   kishor.ruet.cse@gmail.com   |   +880 1724-714156 (WhatsApp)   |   vantage.kishor.tech   |   kishor.tech   |   3d.kishor.tech   |   linkedin.com/in/kishor-kumar-paroi-b06344166   |   github.com/KishorKumarParoi   |   x.com/Mr_paroi</w:t>
             </w:r>
           </w:p>
         </w:tc>
@@ -1819,7 +1819,7 @@
                 <w:b/>
                 <w:sz w:val="16"/>
               </w:rPr>
-              <w:t>KoomAI — High-Performance Loom Alternative</w:t>
+              <w:t>KoomAI — Enterprise Asynchronous Video Intelligence Platform</w:t>
             </w:r>
             <w:r>
               <w:rPr>
@@ -1864,7 +1864,7 @@
                 <w:color w:val="1A1A1A"/>
                 <w:sz w:val="15"/>
               </w:rPr>
-              <w:t>WebRTC Low-Latency Engine &amp; Desktop Client:</w:t>
+              <w:t>WebRTC 60 FPS Engine &amp; Desktop Client:</w:t>
             </w:r>
             <w:r>
               <w:rPr>
@@ -1873,25 +1873,7 @@
                 <w:color w:val="1A1A1A"/>
                 <w:sz w:val="15"/>
               </w:rPr>
-              <w:t xml:space="preserve"> Devised real-time WebRTC media pipeline (</w:t>
-            </w:r>
-            <w:r>
-              <w:rPr>
-                <w:rFonts w:ascii="Georgia" w:hAnsi="Georgia"/>
-                <w:b/>
-                <w:color w:val="1A1A1A"/>
-                <w:sz w:val="15"/>
-              </w:rPr>
-              <w:t>&lt;120ms</w:t>
-            </w:r>
-            <w:r>
-              <w:rPr>
-                <w:rFonts w:ascii="Georgia" w:hAnsi="Georgia"/>
-                <w:b w:val="0"/>
-                <w:color w:val="1A1A1A"/>
-                <w:sz w:val="15"/>
-              </w:rPr>
-              <w:t xml:space="preserve"> latency) and Electron desktop client with native NVENC encoding; sustained 60 FPS 1080p across </w:t>
+              <w:t xml:space="preserve"> Sub-120ms real-time WebRTC media pipeline and Electron desktop client with native NVENC encoding; sustained 60 FPS 1080p across </w:t>
             </w:r>
             <w:r>
               <w:rPr>
@@ -1932,7 +1914,7 @@
                 <w:color w:val="1A1A1A"/>
                 <w:sz w:val="15"/>
               </w:rPr>
-              <w:t>Chrome Extension (Manifest V3):</w:t>
+              <w:t>Autonomous 20-Agent Mesh &amp; Video Chat Copilot:</w:t>
             </w:r>
             <w:r>
               <w:rPr>
@@ -1941,7 +1923,7 @@
                 <w:color w:val="1A1A1A"/>
                 <w:sz w:val="15"/>
               </w:rPr>
-              <w:t xml:space="preserve"> Developed lightweight screen-recording browser extension utilizing offscreen documents for synchronized tab/mic audio mixing, capturing </w:t>
+              <w:t xml:space="preserve"> Deployed 20 concurrent </w:t>
             </w:r>
             <w:r>
               <w:rPr>
@@ -1950,7 +1932,7 @@
                 <w:color w:val="1A1A1A"/>
                 <w:sz w:val="15"/>
               </w:rPr>
-              <w:t>10K+ user recordings</w:t>
+              <w:t>LangGraph</w:t>
             </w:r>
             <w:r>
               <w:rPr>
@@ -1959,7 +1941,25 @@
                 <w:color w:val="1A1A1A"/>
                 <w:sz w:val="15"/>
               </w:rPr>
-              <w:t>.</w:t>
+              <w:t xml:space="preserve"> agents (</w:t>
+            </w:r>
+            <w:r>
+              <w:rPr>
+                <w:rFonts w:ascii="Georgia" w:hAnsi="Georgia"/>
+                <w:b/>
+                <w:color w:val="1A1A1A"/>
+                <w:sz w:val="15"/>
+              </w:rPr>
+              <w:t>&lt;35ms p99</w:t>
+            </w:r>
+            <w:r>
+              <w:rPr>
+                <w:rFonts w:ascii="Georgia" w:hAnsi="Georgia"/>
+                <w:b w:val="0"/>
+                <w:color w:val="1A1A1A"/>
+                <w:sz w:val="15"/>
+              </w:rPr>
+              <w:t>) and interactive video copilot generating 1-click GitHub PRs, Jira user stories, and Playwright tests.</w:t>
             </w:r>
           </w:p>
           <w:p>
@@ -1982,7 +1982,7 @@
                 <w:color w:val="1A1A1A"/>
                 <w:sz w:val="15"/>
               </w:rPr>
-              <w:t>Full-Stack Next.js 16 Cockpit &amp; Express API:</w:t>
+              <w:t>NotebookLLM Studio &amp; AI Job Recon:</w:t>
             </w:r>
             <w:r>
               <w:rPr>
@@ -1991,7 +1991,7 @@
                 <w:color w:val="1A1A1A"/>
                 <w:sz w:val="15"/>
               </w:rPr>
-              <w:t xml:space="preserve"> Built responsive cockpit using </w:t>
+              <w:t xml:space="preserve"> Engineered conversational two-host audio podcast studio, system design interview drills, and automated </w:t>
             </w:r>
             <w:r>
               <w:rPr>
@@ -2000,7 +2000,7 @@
                 <w:color w:val="1A1A1A"/>
                 <w:sz w:val="15"/>
               </w:rPr>
-              <w:t>Next.js 16 App Router</w:t>
+              <w:t>ai-job-search</w:t>
             </w:r>
             <w:r>
               <w:rPr>
@@ -2009,61 +2009,7 @@
                 <w:color w:val="1A1A1A"/>
                 <w:sz w:val="15"/>
               </w:rPr>
-              <w:t xml:space="preserve"> with waveform scrubbing, Express backend with </w:t>
-            </w:r>
-            <w:r>
-              <w:rPr>
-                <w:rFonts w:ascii="Georgia" w:hAnsi="Georgia"/>
-                <w:b/>
-                <w:color w:val="1A1A1A"/>
-                <w:sz w:val="15"/>
-              </w:rPr>
-              <w:t>AWS S3 multipart uploads &amp; CloudFront CDN</w:t>
-            </w:r>
-            <w:r>
-              <w:rPr>
-                <w:rFonts w:ascii="Georgia" w:hAnsi="Georgia"/>
-                <w:b w:val="0"/>
-                <w:color w:val="1A1A1A"/>
-                <w:sz w:val="15"/>
-              </w:rPr>
-              <w:t xml:space="preserve">; curtailed FCP by </w:t>
-            </w:r>
-            <w:r>
-              <w:rPr>
-                <w:rFonts w:ascii="Georgia" w:hAnsi="Georgia"/>
-                <w:b/>
-                <w:color w:val="1A1A1A"/>
-                <w:sz w:val="15"/>
-              </w:rPr>
-              <w:t>58%</w:t>
-            </w:r>
-            <w:r>
-              <w:rPr>
-                <w:rFonts w:ascii="Georgia" w:hAnsi="Georgia"/>
-                <w:b w:val="0"/>
-                <w:color w:val="1A1A1A"/>
-                <w:sz w:val="15"/>
-              </w:rPr>
-              <w:t xml:space="preserve"> and storage spend by </w:t>
-            </w:r>
-            <w:r>
-              <w:rPr>
-                <w:rFonts w:ascii="Georgia" w:hAnsi="Georgia"/>
-                <w:b/>
-                <w:color w:val="1A1A1A"/>
-                <w:sz w:val="15"/>
-              </w:rPr>
-              <w:t>62%</w:t>
-            </w:r>
-            <w:r>
-              <w:rPr>
-                <w:rFonts w:ascii="Georgia" w:hAnsi="Georgia"/>
-                <w:b w:val="0"/>
-                <w:color w:val="1A1A1A"/>
-                <w:sz w:val="15"/>
-              </w:rPr>
-              <w:t>.</w:t>
+              <w:t xml:space="preserve"> Trojan Horse proposals with tailored ATS CVs.</w:t>
             </w:r>
           </w:p>
           <w:p>
@@ -2086,7 +2032,7 @@
                 <w:color w:val="1A1A1A"/>
                 <w:sz w:val="15"/>
               </w:rPr>
-              <w:t>Monetization &amp; Enterprise Workspaces:</w:t>
+              <w:t>Pomodoro Chrome MV3 &amp; Client Invoicing:</w:t>
             </w:r>
             <w:r>
               <w:rPr>
@@ -2095,7 +2041,7 @@
                 <w:color w:val="1A1A1A"/>
                 <w:sz w:val="15"/>
               </w:rPr>
-              <w:t xml:space="preserve"> Integrated end-to-end </w:t>
+              <w:t xml:space="preserve"> Built screen recorder with </w:t>
             </w:r>
             <w:r>
               <w:rPr>
@@ -2104,7 +2050,7 @@
                 <w:color w:val="1A1A1A"/>
                 <w:sz w:val="15"/>
               </w:rPr>
-              <w:t>Stripe billing engine</w:t>
+              <w:t>Pomodoro focus sprints</w:t>
             </w:r>
             <w:r>
               <w:rPr>
@@ -2113,7 +2059,7 @@
                 <w:color w:val="1A1A1A"/>
                 <w:sz w:val="15"/>
               </w:rPr>
-              <w:t xml:space="preserve"> with idempotent webhook handling and multi-tenant team access controls, garnering </w:t>
+              <w:t xml:space="preserve"> and 432Hz meditation audio; coupled video deliverables with instant </w:t>
             </w:r>
             <w:r>
               <w:rPr>
@@ -2122,7 +2068,7 @@
                 <w:color w:val="1A1A1A"/>
                 <w:sz w:val="15"/>
               </w:rPr>
-              <w:t>$24K MRR</w:t>
+              <w:t>Stripe client invoicing</w:t>
             </w:r>
             <w:r>
               <w:rPr>
@@ -2131,7 +2077,7 @@
                 <w:color w:val="1A1A1A"/>
                 <w:sz w:val="15"/>
               </w:rPr>
-              <w:t xml:space="preserve"> in pilot adoption.</w:t>
+              <w:t xml:space="preserve"> ($24K MRR).</w:t>
             </w:r>
           </w:p>
           <w:p>

</xml_diff>

<commit_message>
docs(resume): update resume without compiler point versions in highlights
</commit_message>
<xml_diff>
--- a/resume.docx
+++ b/resume.docx
@@ -3086,7 +3086,7 @@
                 <w:color w:val="1A1A1A"/>
                 <w:sz w:val="15"/>
               </w:rPr>
-              <w:t>Go 1.24</w:t>
+              <w:t>Go API Gateway</w:t>
             </w:r>
             <w:r>
               <w:rPr>
@@ -3095,7 +3095,7 @@
                 <w:color w:val="1A1A1A"/>
                 <w:sz w:val="15"/>
               </w:rPr>
-              <w:t xml:space="preserve"> auth, </w:t>
+              <w:t xml:space="preserve">, </w:t>
             </w:r>
             <w:r>
               <w:rPr>
@@ -3104,7 +3104,7 @@
                 <w:color w:val="1A1A1A"/>
                 <w:sz w:val="15"/>
               </w:rPr>
-              <w:t>Rust 1.85 SIMD</w:t>
+              <w:t>Rust SIMD</w:t>
             </w:r>
             <w:r>
               <w:rPr>
@@ -3113,7 +3113,7 @@
                 <w:color w:val="1A1A1A"/>
                 <w:sz w:val="15"/>
               </w:rPr>
-              <w:t xml:space="preserve"> scoring, and </w:t>
+              <w:t xml:space="preserve"> vector scoring, and </w:t>
             </w:r>
             <w:r>
               <w:rPr>
@@ -4332,7 +4332,7 @@
                 <w:color w:val="1A1A1A"/>
                 <w:sz w:val="15"/>
               </w:rPr>
-              <w:t>Rust 1.85 SIMD</w:t>
+              <w:t>Rust SIMD</w:t>
             </w:r>
             <w:r>
               <w:rPr>
@@ -4350,7 +4350,7 @@
                 <w:color w:val="1A1A1A"/>
                 <w:sz w:val="15"/>
               </w:rPr>
-              <w:t>Go cloud gateway</w:t>
+              <w:t>Go edge gateway</w:t>
             </w:r>
             <w:r>
               <w:rPr>
@@ -4512,7 +4512,7 @@
                 <w:i/>
                 <w:sz w:val="14"/>
               </w:rPr>
-              <w:t>Bare-Metal Systems in Rust 1.85, Concurrency &amp; Pipelines</w:t>
+              <w:t>Bare-Metal Systems in Rust, Concurrency &amp; Pipelines</w:t>
             </w:r>
           </w:p>
           <w:p>
@@ -4544,7 +4544,7 @@
                 <w:color w:val="1A1A1A"/>
                 <w:sz w:val="15"/>
               </w:rPr>
-              <w:t>Rust 1.85</w:t>
+              <w:t>Rust</w:t>
             </w:r>
             <w:r>
               <w:rPr>

</xml_diff>

<commit_message>
docs(resume): update header section with AI Systems Architect powerhouse headline
</commit_message>
<xml_diff>
--- a/resume.docx
+++ b/resume.docx
@@ -110,9 +110,10 @@
             <w:r>
               <w:rPr>
                 <w:rFonts w:ascii="Georgia" w:hAnsi="Georgia"/>
-                <w:sz w:val="17"/>
-              </w:rPr>
-              <w:t>B.Tech / B.Sc. - Computer Science &amp; Engineering @ RUET</w:t>
+                <w:b/>
+                <w:sz w:val="14"/>
+              </w:rPr>
+              <w:t>AI Systems Architect | (Dev/ML/LLM/AI)Ops | Founder@KoomAI | FDE(LangGraph, Kubernetes, Kubeflow, GCP, Hybrid RAG&lt;35ms, Agent Mesh, AI Security) | vLLM, Finetune | Data Engineer(Azure, AWS, Databricks, Snowflake) | Rust SIMD</w:t>
             </w:r>
           </w:p>
           <w:p>

</xml_diff>